<commit_message>
enabled search button and the user management section
</commit_message>
<xml_diff>
--- a/MedShield_document.docx
+++ b/MedShield_document.docx
@@ -279,6 +279,9 @@
     </w:p>
     <w:p>
       <w:r>
+        <w:rPr>
+          <w:noProof/>
+        </w:rPr>
         <w:drawing>
           <wp:inline distT="0" distB="0" distL="0" distR="0" wp14:anchorId="2575D3D9" wp14:editId="70BE2BF9">
             <wp:extent cx="5731510" cy="3223895"/>
@@ -373,7 +376,107 @@
         <w:t>their details is showing in the overview.</w:t>
       </w:r>
     </w:p>
-    <w:p/>
+    <w:p>
+      <w:r>
+        <w:lastRenderedPageBreak/>
+        <w:drawing>
+          <wp:inline distT="0" distB="0" distL="0" distR="0" wp14:anchorId="5D9CB3E2" wp14:editId="60CEF5E7">
+            <wp:extent cx="5731510" cy="3223895"/>
+            <wp:effectExtent l="0" t="0" r="2540" b="0"/>
+            <wp:docPr id="1677017170" name="Picture 2"/>
+            <wp:cNvGraphicFramePr>
+              <a:graphicFrameLocks xmlns:a="http://schemas.openxmlformats.org/drawingml/2006/main" noChangeAspect="1"/>
+            </wp:cNvGraphicFramePr>
+            <a:graphic xmlns:a="http://schemas.openxmlformats.org/drawingml/2006/main">
+              <a:graphicData uri="http://schemas.openxmlformats.org/drawingml/2006/picture">
+                <pic:pic xmlns:pic="http://schemas.openxmlformats.org/drawingml/2006/picture">
+                  <pic:nvPicPr>
+                    <pic:cNvPr id="0" name="Picture 6"/>
+                    <pic:cNvPicPr>
+                      <a:picLocks noChangeAspect="1" noChangeArrowheads="1"/>
+                    </pic:cNvPicPr>
+                  </pic:nvPicPr>
+                  <pic:blipFill>
+                    <a:blip r:embed="rId6" cstate="print">
+                      <a:extLst>
+                        <a:ext uri="{28A0092B-C50C-407E-A947-70E740481C1C}">
+                          <a14:useLocalDpi xmlns:a14="http://schemas.microsoft.com/office/drawing/2010/main" val="0"/>
+                        </a:ext>
+                      </a:extLst>
+                    </a:blip>
+                    <a:srcRect/>
+                    <a:stretch>
+                      <a:fillRect/>
+                    </a:stretch>
+                  </pic:blipFill>
+                  <pic:spPr bwMode="auto">
+                    <a:xfrm>
+                      <a:off x="0" y="0"/>
+                      <a:ext cx="5731510" cy="3223895"/>
+                    </a:xfrm>
+                    <a:prstGeom prst="rect">
+                      <a:avLst/>
+                    </a:prstGeom>
+                    <a:noFill/>
+                    <a:ln>
+                      <a:noFill/>
+                    </a:ln>
+                  </pic:spPr>
+                </pic:pic>
+              </a:graphicData>
+            </a:graphic>
+          </wp:inline>
+        </w:drawing>
+      </w:r>
+    </w:p>
+    <w:p>
+      <w:pPr>
+        <w:pStyle w:val="Heading1"/>
+      </w:pPr>
+      <w:r>
+        <w:t>Pending:</w:t>
+      </w:r>
+    </w:p>
+    <w:p>
+      <w:pPr>
+        <w:pStyle w:val="NoSpacing"/>
+      </w:pPr>
+      <w:r>
+        <w:t>1.</w:t>
+      </w:r>
+      <w:r>
+        <w:t xml:space="preserve">The web don’t have any memory to store the patient list and </w:t>
+      </w:r>
+      <w:r>
+        <w:t>it is constant it is not increasing when we enter the patient details.</w:t>
+      </w:r>
+    </w:p>
+    <w:p>
+      <w:pPr>
+        <w:pStyle w:val="NoSpacing"/>
+      </w:pPr>
+      <w:r>
+        <w:t>2.Kiro points are over 50/50.</w:t>
+      </w:r>
+    </w:p>
+    <w:p>
+      <w:pPr>
+        <w:pStyle w:val="NoSpacing"/>
+      </w:pPr>
+      <w:r>
+        <w:t>3.pushing to git.</w:t>
+      </w:r>
+    </w:p>
+    <w:p>
+      <w:pPr>
+        <w:pStyle w:val="NoSpacing"/>
+      </w:pPr>
+    </w:p>
+    <w:p>
+      <w:pPr>
+        <w:pStyle w:val="NoSpacing"/>
+      </w:pPr>
+    </w:p>
     <w:p/>
     <w:p/>
     <w:p/>

</xml_diff>